<commit_message>
results based on simulated data updated
</commit_message>
<xml_diff>
--- a/i_test/test_D6_Tabella_2_asl_2025/g_output/D6_Table_2_CE.docx
+++ b/i_test/test_D6_Tabella_2_asl_2025/g_output/D6_Table_2_CE.docx
@@ -27,7 +27,7 @@
               <w:pStyle w:val="Normal"/>
             </w:pPr>
             <w:r>
-              <w:t>1649</w:t>
+              <w:t>1629</w:t>
             </w:r>
           </w:p>
         </w:tc>
@@ -61,17 +61,17 @@
               <w:pStyle w:val="Normal"/>
             </w:pPr>
             <w:r>
-              <w:t>A10BD</w:t>
-            </w:r>
-          </w:p>
-        </w:tc>
-        <w:tc>
-          <w:p>
-            <w:pPr>
-              <w:pStyle w:val="Normal"/>
-            </w:pPr>
-            <w:r>
-              <w:t>1.638 (99,3%)</w:t>
+              <w:t>1</w:t>
+            </w:r>
+          </w:p>
+        </w:tc>
+        <w:tc>
+          <w:p>
+            <w:pPr>
+              <w:pStyle w:val="Normal"/>
+            </w:pPr>
+            <w:r>
+              <w:t>A10BD B10BD C10BD C10BX C10CE 6 (0,4%)</w:t>
             </w:r>
           </w:p>
         </w:tc>
@@ -83,17 +83,17 @@
               <w:pStyle w:val="Normal"/>
             </w:pPr>
             <w:r>
-              <w:t>A10AE</w:t>
-            </w:r>
-          </w:p>
-        </w:tc>
-        <w:tc>
-          <w:p>
-            <w:pPr>
-              <w:pStyle w:val="Normal"/>
-            </w:pPr>
-            <w:r>
-              <w:t>858 (52,0%)</w:t>
+              <w:t>2</w:t>
+            </w:r>
+          </w:p>
+        </w:tc>
+        <w:tc>
+          <w:p>
+            <w:pPr>
+              <w:pStyle w:val="Normal"/>
+            </w:pPr>
+            <w:r>
+              <w:t>A10BD B10BD C10BD C10BH C10CE 5 (0,3%)</w:t>
             </w:r>
           </w:p>
         </w:tc>
@@ -105,17 +105,17 @@
               <w:pStyle w:val="Normal"/>
             </w:pPr>
             <w:r>
-              <w:t>A10BH</w:t>
-            </w:r>
-          </w:p>
-        </w:tc>
-        <w:tc>
-          <w:p>
-            <w:pPr>
-              <w:pStyle w:val="Normal"/>
-            </w:pPr>
-            <w:r>
-              <w:t>526 (31,9%)</w:t>
+              <w:t>3</w:t>
+            </w:r>
+          </w:p>
+        </w:tc>
+        <w:tc>
+          <w:p>
+            <w:pPr>
+              <w:pStyle w:val="Normal"/>
+            </w:pPr>
+            <w:r>
+              <w:t>A10BD A10BX B10BD C10BD C10CE 5 (0,3%)</w:t>
             </w:r>
           </w:p>
         </w:tc>
@@ -127,17 +127,17 @@
               <w:pStyle w:val="Normal"/>
             </w:pPr>
             <w:r>
-              <w:t>A10BK</w:t>
-            </w:r>
-          </w:p>
-        </w:tc>
-        <w:tc>
-          <w:p>
-            <w:pPr>
-              <w:pStyle w:val="Normal"/>
-            </w:pPr>
-            <w:r>
-              <w:t>500 (30,3%)</w:t>
+              <w:t>4</w:t>
+            </w:r>
+          </w:p>
+        </w:tc>
+        <w:tc>
+          <w:p>
+            <w:pPr>
+              <w:pStyle w:val="Normal"/>
+            </w:pPr>
+            <w:r>
+              <w:t>A10AE A10BD B10BD B10BJ C10BD C10CE 5 (0,3%)</w:t>
             </w:r>
           </w:p>
         </w:tc>
@@ -149,17 +149,17 @@
               <w:pStyle w:val="Normal"/>
             </w:pPr>
             <w:r>
-              <w:t>A10BJ</w:t>
-            </w:r>
-          </w:p>
-        </w:tc>
-        <w:tc>
-          <w:p>
-            <w:pPr>
-              <w:pStyle w:val="Normal"/>
-            </w:pPr>
-            <w:r>
-              <w:t>467 (28,3%)</w:t>
+              <w:t>5</w:t>
+            </w:r>
+          </w:p>
+        </w:tc>
+        <w:tc>
+          <w:p>
+            <w:pPr>
+              <w:pStyle w:val="Normal"/>
+            </w:pPr>
+            <w:r>
+              <w:t>A10BD B10AE B10BD B10BJ C10BD 5 (0,3%)</w:t>
             </w:r>
           </w:p>
         </w:tc>
@@ -171,17 +171,105 @@
               <w:pStyle w:val="Normal"/>
             </w:pPr>
             <w:r>
-              <w:t>A10BX</w:t>
-            </w:r>
-          </w:p>
-        </w:tc>
-        <w:tc>
-          <w:p>
-            <w:pPr>
-              <w:pStyle w:val="Normal"/>
-            </w:pPr>
-            <w:r>
-              <w:t>453 (27,5%)</w:t>
+              <w:t>6</w:t>
+            </w:r>
+          </w:p>
+        </w:tc>
+        <w:tc>
+          <w:p>
+            <w:pPr>
+              <w:pStyle w:val="Normal"/>
+            </w:pPr>
+            <w:r>
+              <w:t>A10BD B10BD B10BE C10BD C10CE 5 (0,3%)</w:t>
+            </w:r>
+          </w:p>
+        </w:tc>
+      </w:tr>
+      <w:tr>
+        <w:tc>
+          <w:p>
+            <w:pPr>
+              <w:pStyle w:val="Normal"/>
+            </w:pPr>
+            <w:r>
+              <w:t>7</w:t>
+            </w:r>
+          </w:p>
+        </w:tc>
+        <w:tc>
+          <w:p>
+            <w:pPr>
+              <w:pStyle w:val="Normal"/>
+            </w:pPr>
+            <w:r>
+              <w:t>A10BD A10BK B10BD C10BD C10BK 5 (0,3%)</w:t>
+            </w:r>
+          </w:p>
+        </w:tc>
+      </w:tr>
+      <w:tr>
+        <w:tc>
+          <w:p>
+            <w:pPr>
+              <w:pStyle w:val="Normal"/>
+            </w:pPr>
+            <w:r>
+              <w:t>8</w:t>
+            </w:r>
+          </w:p>
+        </w:tc>
+        <w:tc>
+          <w:p>
+            <w:pPr>
+              <w:pStyle w:val="Normal"/>
+            </w:pPr>
+            <w:r>
+              <w:t>A10BD B10BD B10BJ C10BD C10CE 5 (0,3%)</w:t>
+            </w:r>
+          </w:p>
+        </w:tc>
+      </w:tr>
+      <w:tr>
+        <w:tc>
+          <w:p>
+            <w:pPr>
+              <w:pStyle w:val="Normal"/>
+            </w:pPr>
+            <w:r>
+              <w:t>9</w:t>
+            </w:r>
+          </w:p>
+        </w:tc>
+        <w:tc>
+          <w:p>
+            <w:pPr>
+              <w:pStyle w:val="Normal"/>
+            </w:pPr>
+            <w:r>
+              <w:t>A10AE A10BD B10BD B10BE C10BD 4 (0,2%)</w:t>
+            </w:r>
+          </w:p>
+        </w:tc>
+      </w:tr>
+      <w:tr>
+        <w:tc>
+          <w:p>
+            <w:pPr>
+              <w:pStyle w:val="Normal"/>
+            </w:pPr>
+            <w:r>
+              <w:t>10</w:t>
+            </w:r>
+          </w:p>
+        </w:tc>
+        <w:tc>
+          <w:p>
+            <w:pPr>
+              <w:pStyle w:val="Normal"/>
+            </w:pPr>
+            <w:r>
+              <w:t>A10BD B10BD C10BD C10BJ C10BX 4 (0,2%)</w:t>
             </w:r>
           </w:p>
         </w:tc>

</xml_diff>

<commit_message>
updated results based on simulated data uploaded
</commit_message>
<xml_diff>
--- a/i_test/test_D6_Tabella_2_asl_2025/g_output/D6_Table_2_CE.docx
+++ b/i_test/test_D6_Tabella_2_asl_2025/g_output/D6_Table_2_CE.docx
@@ -39,7 +39,7 @@
               <w:pStyle w:val="Normal"/>
             </w:pPr>
             <w:r>
-              <w:t>Combinazioni ATC IV livello (*)</w:t>
+              <w:t>Combinazioni di ≥5 ATC IV livello (*)</w:t>
             </w:r>
           </w:p>
         </w:tc>
@@ -71,7 +71,7 @@
               <w:pStyle w:val="Normal"/>
             </w:pPr>
             <w:r>
-              <w:t>A10BD B10BD C10BD C10BX C10CE 6 (0,4%)</w:t>
+              <w:t>d a B10BD C10BD N15CE 24 (1,5%)</w:t>
             </w:r>
           </w:p>
         </w:tc>
@@ -93,7 +93,7 @@
               <w:pStyle w:val="Normal"/>
             </w:pPr>
             <w:r>
-              <w:t>A10BD B10BD C10BD C10BH C10CE 5 (0,3%)</w:t>
+              <w:t>a B10BD C10BD C10CE N11BD 24 (1,5%)</w:t>
             </w:r>
           </w:p>
         </w:tc>
@@ -115,7 +115,7 @@
               <w:pStyle w:val="Normal"/>
             </w:pPr>
             <w:r>
-              <w:t>A10BD A10BX B10BD C10BD C10CE 5 (0,3%)</w:t>
+              <w:t>d a B10BD C10BD C10CE 23 (1,4%)</w:t>
             </w:r>
           </w:p>
         </w:tc>
@@ -137,7 +137,7 @@
               <w:pStyle w:val="Normal"/>
             </w:pPr>
             <w:r>
-              <w:t>A10AE A10BD B10BD B10BJ C10BD C10CE 5 (0,3%)</w:t>
+              <w:t>d a B10BD C10BD D15CE 23 (1,4%)</w:t>
             </w:r>
           </w:p>
         </w:tc>
@@ -159,7 +159,7 @@
               <w:pStyle w:val="Normal"/>
             </w:pPr>
             <w:r>
-              <w:t>A10BD B10AE B10BD B10BJ C10BD 5 (0,3%)</w:t>
+              <w:t>d a B10BD C10BD J01BK 23 (1,4%)</w:t>
             </w:r>
           </w:p>
         </w:tc>
@@ -181,7 +181,7 @@
               <w:pStyle w:val="Normal"/>
             </w:pPr>
             <w:r>
-              <w:t>A10BD B10BD B10BE C10BD C10CE 5 (0,3%)</w:t>
+              <w:t>a B10BD C10BD C10CE N05BD 23 (1,4%)</w:t>
             </w:r>
           </w:p>
         </w:tc>
@@ -203,7 +203,7 @@
               <w:pStyle w:val="Normal"/>
             </w:pPr>
             <w:r>
-              <w:t>A10BD A10BK B10BD C10BD C10BK 5 (0,3%)</w:t>
+              <w:t>a B10BD C10BD C10CE N17BD 23 (1,4%)</w:t>
             </w:r>
           </w:p>
         </w:tc>
@@ -225,7 +225,7 @@
               <w:pStyle w:val="Normal"/>
             </w:pPr>
             <w:r>
-              <w:t>A10BD B10BD B10BJ C10BD C10CE 5 (0,3%)</w:t>
+              <w:t>d a B10BD C10BD D19BD 22 (1,4%)</w:t>
             </w:r>
           </w:p>
         </w:tc>
@@ -247,7 +247,7 @@
               <w:pStyle w:val="Normal"/>
             </w:pPr>
             <w:r>
-              <w:t>A10AE A10BD B10BD B10BE C10BD 4 (0,2%)</w:t>
+              <w:t>a B10BD C10BD C10CE J15CE 22 (1,4%)</w:t>
             </w:r>
           </w:p>
         </w:tc>
@@ -269,7 +269,249 @@
               <w:pStyle w:val="Normal"/>
             </w:pPr>
             <w:r>
-              <w:t>A10BD B10BD C10BD C10BJ C10BX 4 (0,2%)</w:t>
+              <w:t>a B10BD C10BD C10CE N15CE 22 (1,4%)</w:t>
+            </w:r>
+          </w:p>
+        </w:tc>
+      </w:tr>
+      <w:tr>
+        <w:tc>
+          <w:p>
+            <w:pPr>
+              <w:pStyle w:val="Normal"/>
+            </w:pPr>
+            <w:r>
+              <w:t>Combinazioni di ≥10 ATC IV livello (*)</w:t>
+            </w:r>
+          </w:p>
+        </w:tc>
+        <w:tc>
+          <w:p>
+            <w:pPr>
+              <w:pStyle w:val="Normal"/>
+            </w:pPr>
+            <w:r>
+              <w:t/>
+            </w:r>
+          </w:p>
+        </w:tc>
+      </w:tr>
+      <w:tr>
+        <w:tc>
+          <w:p>
+            <w:pPr>
+              <w:pStyle w:val="Normal"/>
+            </w:pPr>
+            <w:r>
+              <w:t>1</w:t>
+            </w:r>
+          </w:p>
+        </w:tc>
+        <w:tc>
+          <w:p>
+            <w:pPr>
+              <w:pStyle w:val="Normal"/>
+            </w:pPr>
+            <w:r>
+              <w:t>a d a B10BD C10BD C10BJ C10CE D08BD N01BK N11BD 2 (0,1%)</w:t>
+            </w:r>
+          </w:p>
+        </w:tc>
+      </w:tr>
+      <w:tr>
+        <w:tc>
+          <w:p>
+            <w:pPr>
+              <w:pStyle w:val="Normal"/>
+            </w:pPr>
+            <w:r>
+              <w:t>2</w:t>
+            </w:r>
+          </w:p>
+        </w:tc>
+        <w:tc>
+          <w:p>
+            <w:pPr>
+              <w:pStyle w:val="Normal"/>
+            </w:pPr>
+            <w:r>
+              <w:t>a B10BD C10BD C10BJ D03BX J02BJ J13BD J19BD N13BD N15CE 2 (0,1%)</w:t>
+            </w:r>
+          </w:p>
+        </w:tc>
+      </w:tr>
+      <w:tr>
+        <w:tc>
+          <w:p>
+            <w:pPr>
+              <w:pStyle w:val="Normal"/>
+            </w:pPr>
+            <w:r>
+              <w:t>3</w:t>
+            </w:r>
+          </w:p>
+        </w:tc>
+        <w:tc>
+          <w:p>
+            <w:pPr>
+              <w:pStyle w:val="Normal"/>
+            </w:pPr>
+            <w:r>
+              <w:t>a B10BD C10BD C10BJ D10D1 D12BD D15CE J02BJ J07BD J19BD 2 (0,1%)</w:t>
+            </w:r>
+          </w:p>
+        </w:tc>
+      </w:tr>
+      <w:tr>
+        <w:tc>
+          <w:p>
+            <w:pPr>
+              <w:pStyle w:val="Normal"/>
+            </w:pPr>
+            <w:r>
+              <w:t>4</w:t>
+            </w:r>
+          </w:p>
+        </w:tc>
+        <w:tc>
+          <w:p>
+            <w:pPr>
+              <w:pStyle w:val="Normal"/>
+            </w:pPr>
+            <w:r>
+              <w:t>a B10BD C10BD C10BJ D10D1 D12BD D15CE J02BJ J07BD N04BH 2 (0,1%)</w:t>
+            </w:r>
+          </w:p>
+        </w:tc>
+      </w:tr>
+      <w:tr>
+        <w:tc>
+          <w:p>
+            <w:pPr>
+              <w:pStyle w:val="Normal"/>
+            </w:pPr>
+            <w:r>
+              <w:t>5</w:t>
+            </w:r>
+          </w:p>
+        </w:tc>
+        <w:tc>
+          <w:p>
+            <w:pPr>
+              <w:pStyle w:val="Normal"/>
+            </w:pPr>
+            <w:r>
+              <w:t>a B10BD C10BD C10BJ D10D1 D12BD D15CE J02BJ J19BD N04BH 2 (0,1%)</w:t>
+            </w:r>
+          </w:p>
+        </w:tc>
+      </w:tr>
+      <w:tr>
+        <w:tc>
+          <w:p>
+            <w:pPr>
+              <w:pStyle w:val="Normal"/>
+            </w:pPr>
+            <w:r>
+              <w:t>6</w:t>
+            </w:r>
+          </w:p>
+        </w:tc>
+        <w:tc>
+          <w:p>
+            <w:pPr>
+              <w:pStyle w:val="Normal"/>
+            </w:pPr>
+            <w:r>
+              <w:t>a B10BD C10BD C10BJ D10D1 D12BD D15CE J07BD J19BD N04BH 2 (0,1%)</w:t>
+            </w:r>
+          </w:p>
+        </w:tc>
+      </w:tr>
+      <w:tr>
+        <w:tc>
+          <w:p>
+            <w:pPr>
+              <w:pStyle w:val="Normal"/>
+            </w:pPr>
+            <w:r>
+              <w:t>7</w:t>
+            </w:r>
+          </w:p>
+        </w:tc>
+        <w:tc>
+          <w:p>
+            <w:pPr>
+              <w:pStyle w:val="Normal"/>
+            </w:pPr>
+            <w:r>
+              <w:t>a B10BD C10BD C10BJ D10D1 D12BD J02BJ J07BD J19BD N04BH 2 (0,1%)</w:t>
+            </w:r>
+          </w:p>
+        </w:tc>
+      </w:tr>
+      <w:tr>
+        <w:tc>
+          <w:p>
+            <w:pPr>
+              <w:pStyle w:val="Normal"/>
+            </w:pPr>
+            <w:r>
+              <w:t>8</w:t>
+            </w:r>
+          </w:p>
+        </w:tc>
+        <w:tc>
+          <w:p>
+            <w:pPr>
+              <w:pStyle w:val="Normal"/>
+            </w:pPr>
+            <w:r>
+              <w:t>a B10BD C10BD C10BJ D10D1 D15CE J02BJ J07BD J19BD N04BH 2 (0,1%)</w:t>
+            </w:r>
+          </w:p>
+        </w:tc>
+      </w:tr>
+      <w:tr>
+        <w:tc>
+          <w:p>
+            <w:pPr>
+              <w:pStyle w:val="Normal"/>
+            </w:pPr>
+            <w:r>
+              <w:t>9</w:t>
+            </w:r>
+          </w:p>
+        </w:tc>
+        <w:tc>
+          <w:p>
+            <w:pPr>
+              <w:pStyle w:val="Normal"/>
+            </w:pPr>
+            <w:r>
+              <w:t>a B10BD C10BD C10BJ D12BD D15CE J02BJ J07BD J19BD N04BH 2 (0,1%)</w:t>
+            </w:r>
+          </w:p>
+        </w:tc>
+      </w:tr>
+      <w:tr>
+        <w:tc>
+          <w:p>
+            <w:pPr>
+              <w:pStyle w:val="Normal"/>
+            </w:pPr>
+            <w:r>
+              <w:t>10</w:t>
+            </w:r>
+          </w:p>
+        </w:tc>
+        <w:tc>
+          <w:p>
+            <w:pPr>
+              <w:pStyle w:val="Normal"/>
+            </w:pPr>
+            <w:r>
+              <w:t>a B10BD C10BD D04BH D10D1 J05BD J08BD J13BD J14CE N12BD 2 (0,1%)</w:t>
             </w:r>
           </w:p>
         </w:tc>

</xml_diff>